<commit_message>
Fix DOC Formatting V3
</commit_message>
<xml_diff>
--- a/backend/DOCS/Annexure-3-Net-Metering.docx
+++ b/backend/DOCS/Annexure-3-Net-Metering.docx
@@ -9101,7 +9101,6 @@
         <w:rPr>
           <w:rFonts w:ascii="Times New Roman" w:eastAsia="Times New Roman" w:hAnsi="Times New Roman" w:cs="Times New Roman"/>
           <w:color w:val="2F2F2F"/>
-          <w:spacing w:val="-62"/>
           <w:sz w:val="24"/>
         </w:rPr>
       </w:pPr>
@@ -9314,16 +9313,15 @@
           <w:color w:val="2F2F2F"/>
           <w:sz w:val="24"/>
         </w:rPr>
-        <w:t>MSEDCL</w:t>
-      </w:r>
-      <w:r>
-        <w:rPr>
-          <w:rFonts w:ascii="Times New Roman" w:eastAsia="Times New Roman" w:hAnsi="Times New Roman" w:cs="Times New Roman"/>
-          <w:color w:val="2F2F2F"/>
-          <w:spacing w:val="-62"/>
-          <w:sz w:val="24"/>
-        </w:rPr>
-        <w:t xml:space="preserve"> </w:t>
+        <w:t>MSEDC</w:t>
+      </w:r>
+      <w:r>
+        <w:rPr>
+          <w:rFonts w:ascii="Times New Roman" w:eastAsia="Times New Roman" w:hAnsi="Times New Roman" w:cs="Times New Roman"/>
+          <w:color w:val="2F2F2F"/>
+          <w:sz w:val="24"/>
+        </w:rPr>
+        <w:t>L</w:t>
       </w:r>
     </w:p>
     <w:p>
@@ -9337,7 +9335,6 @@
         <w:rPr>
           <w:rFonts w:ascii="Times New Roman" w:eastAsia="Times New Roman" w:hAnsi="Times New Roman" w:cs="Times New Roman"/>
           <w:color w:val="2F2F2F"/>
-          <w:spacing w:val="-62"/>
           <w:sz w:val="24"/>
         </w:rPr>
       </w:pPr>
@@ -9352,18 +9349,26 @@
         <w:spacing w:before="88" w:after="0" w:line="240" w:lineRule="auto"/>
         <w:rPr>
           <w:rFonts w:ascii="Times New Roman" w:eastAsia="Times New Roman" w:hAnsi="Times New Roman" w:cs="Times New Roman"/>
-          <w:sz w:val="24"/>
-        </w:rPr>
-      </w:pPr>
-      <w:r>
+          <w:color w:val="2F2F2F"/>
+          <w:sz w:val="24"/>
+        </w:rPr>
+      </w:pPr>
+    </w:p>
+    <w:p>
+      <w:pPr>
+        <w:tabs>
+          <w:tab w:val="left" w:pos="3484"/>
+          <w:tab w:val="left" w:pos="5859"/>
+          <w:tab w:val="left" w:pos="9349"/>
+        </w:tabs>
+        <w:spacing w:before="88" w:after="0" w:line="240" w:lineRule="auto"/>
         <w:rPr>
           <w:rFonts w:ascii="Times New Roman" w:eastAsia="Times New Roman" w:hAnsi="Times New Roman" w:cs="Times New Roman"/>
           <w:color w:val="2F2F2F"/>
           <w:spacing w:val="-62"/>
           <w:sz w:val="24"/>
         </w:rPr>
-        <w:t xml:space="preserve">        </w:t>
-      </w:r>
+      </w:pPr>
       <w:r>
         <w:rPr>
           <w:rFonts w:ascii="Times New Roman" w:eastAsia="Times New Roman" w:hAnsi="Times New Roman" w:cs="Times New Roman"/>
@@ -9371,7 +9376,7 @@
           <w:spacing w:val="-62"/>
           <w:sz w:val="24"/>
         </w:rPr>
-        <w:t xml:space="preserve">       </w:t>
+        <w:t xml:space="preserve"> </w:t>
       </w:r>
       <w:r>
         <w:rPr>

</xml_diff>